<commit_message>
docs(sprint13): close pending Sprint 13 documentation deliverables
Adds a dedicated OpenAPI 3.0 spec for the MINSA/DIRESA/SINADEF institutional
API, updates README/ROADMAP docs and the traceability matrix (RF-002,
RF-005, RF-007, RF-008, RF-009) with the Sprint 13 scope, and marks the
Sprint 13 plan's own documentation deliverable as completed (6/6, closed).

Co-Authored-By: Claude Sonnet 5 <noreply@anthropic.com>
</commit_message>
<xml_diff>
--- a/Documentation/informes/Plan_Iteracion_Sprint13_RespiCare.docx
+++ b/Documentation/informes/Plan_Iteracion_Sprint13_RespiCare.docx
@@ -1353,7 +1353,7 @@
                 <w:i w:val="0"/>
                 <w:sz w:val="24"/>
               </w:rPr>
-              <w:t xml:space="preserve">Anotaciones </w:t>
+              <w:t xml:space="preserve">Publicado </w:t>
             </w:r>
             <w:r>
               <w:rPr>
@@ -1362,7 +1362,7 @@
                 <w:i w:val="0"/>
                 <w:sz w:val="18"/>
               </w:rPr>
-              <w:t>@swagger</w:t>
+              <w:t>backend/openapi/institutional-api.yaml</w:t>
             </w:r>
             <w:r>
               <w:rPr>
@@ -1371,43 +1371,7 @@
                 <w:i w:val="0"/>
                 <w:sz w:val="24"/>
               </w:rPr>
-              <w:t xml:space="preserve"> agregadas en </w:t>
-            </w:r>
-            <w:r>
-              <w:rPr>
-                <w:rFonts w:ascii="Consolas" w:hAnsi="Consolas" w:cs="Consolas"/>
-                <w:b w:val="0"/>
-                <w:i w:val="0"/>
-                <w:sz w:val="18"/>
-              </w:rPr>
-              <w:t>institutionalController.ts</w:t>
-            </w:r>
-            <w:r>
-              <w:rPr>
-                <w:rFonts w:ascii="Times New Roman" w:hAnsi="Times New Roman" w:cs="Times New Roman"/>
-                <w:b w:val="0"/>
-                <w:i w:val="0"/>
-                <w:sz w:val="24"/>
-              </w:rPr>
-              <w:t xml:space="preserve"> (autodescubiertas por </w:t>
-            </w:r>
-            <w:r>
-              <w:rPr>
-                <w:rFonts w:ascii="Consolas" w:hAnsi="Consolas" w:cs="Consolas"/>
-                <w:b w:val="0"/>
-                <w:i w:val="0"/>
-                <w:sz w:val="18"/>
-              </w:rPr>
-              <w:t>config/swagger.ts</w:t>
-            </w:r>
-            <w:r>
-              <w:rPr>
-                <w:rFonts w:ascii="Times New Roman" w:hAnsi="Times New Roman" w:cs="Times New Roman"/>
-                <w:b w:val="0"/>
-                <w:i w:val="0"/>
-                <w:sz w:val="24"/>
-              </w:rPr>
-              <w:t>); falta publicar/enlazar un documento OpenAPI dedicado para el consumidor externo</w:t>
+              <w:t xml:space="preserve"> (OpenAPI 3.0.3 independiente del spec interno, cubre los 3 endpoints con esquemas, ejemplos y respuestas de error)</w:t>
             </w:r>
           </w:p>
         </w:tc>
@@ -1427,7 +1391,7 @@
                 <w:i w:val="0"/>
                 <w:sz w:val="24"/>
               </w:rPr>
-              <w:t>Parcial</w:t>
+              <w:t>Sí</w:t>
             </w:r>
           </w:p>
         </w:tc>
@@ -1799,7 +1763,79 @@
                 <w:i w:val="0"/>
                 <w:sz w:val="24"/>
               </w:rPr>
-              <w:t>Pendiente</w:t>
+              <w:t xml:space="preserve">README.md (secciones de backend/frontend + nueva subsección "Sprint 13"), </w:t>
+            </w:r>
+            <w:r>
+              <w:rPr>
+                <w:rFonts w:ascii="Consolas" w:hAnsi="Consolas" w:cs="Consolas"/>
+                <w:b w:val="0"/>
+                <w:i w:val="0"/>
+                <w:sz w:val="18"/>
+              </w:rPr>
+              <w:t>docs/roadmaps/PROJECT_ROADMAP.md</w:t>
+            </w:r>
+            <w:r>
+              <w:rPr>
+                <w:rFonts w:ascii="Times New Roman" w:hAnsi="Times New Roman" w:cs="Times New Roman"/>
+                <w:b w:val="0"/>
+                <w:i w:val="0"/>
+                <w:sz w:val="24"/>
+              </w:rPr>
+              <w:t xml:space="preserve"> (Fase 18.4 nueva, Fase 22.2 actualizada), </w:t>
+            </w:r>
+            <w:r>
+              <w:rPr>
+                <w:rFonts w:ascii="Consolas" w:hAnsi="Consolas" w:cs="Consolas"/>
+                <w:b w:val="0"/>
+                <w:i w:val="0"/>
+                <w:sz w:val="18"/>
+              </w:rPr>
+              <w:t>docs/roadmaps/BACKEND_ROADMAP.md</w:t>
+            </w:r>
+            <w:r>
+              <w:rPr>
+                <w:rFonts w:ascii="Times New Roman" w:hAnsi="Times New Roman" w:cs="Times New Roman"/>
+                <w:b w:val="0"/>
+                <w:i w:val="0"/>
+                <w:sz w:val="24"/>
+              </w:rPr>
+              <w:t xml:space="preserve"> y </w:t>
+            </w:r>
+            <w:r>
+              <w:rPr>
+                <w:rFonts w:ascii="Consolas" w:hAnsi="Consolas" w:cs="Consolas"/>
+                <w:b w:val="0"/>
+                <w:i w:val="0"/>
+                <w:sz w:val="18"/>
+              </w:rPr>
+              <w:t>docs/roadmaps/AI_SERVICES_ROADMAP.md</w:t>
+            </w:r>
+            <w:r>
+              <w:rPr>
+                <w:rFonts w:ascii="Times New Roman" w:hAnsi="Times New Roman" w:cs="Times New Roman"/>
+                <w:b w:val="0"/>
+                <w:i w:val="0"/>
+                <w:sz w:val="24"/>
+              </w:rPr>
+              <w:t xml:space="preserve"> (sección Sprint 13 agregada), </w:t>
+            </w:r>
+            <w:r>
+              <w:rPr>
+                <w:rFonts w:ascii="Consolas" w:hAnsi="Consolas" w:cs="Consolas"/>
+                <w:b w:val="0"/>
+                <w:i w:val="0"/>
+                <w:sz w:val="18"/>
+              </w:rPr>
+              <w:t>Documentation/trazabilidad/Matriz_Trazabilidad_RespiCare.xlsx</w:t>
+            </w:r>
+            <w:r>
+              <w:rPr>
+                <w:rFonts w:ascii="Times New Roman" w:hAnsi="Times New Roman" w:cs="Times New Roman"/>
+                <w:b w:val="0"/>
+                <w:i w:val="0"/>
+                <w:sz w:val="24"/>
+              </w:rPr>
+              <w:t xml:space="preserve"> (RF-002/RF-005/RF-007/RF-008/RF-009 ampliados con el alcance de Sprint 13)</w:t>
             </w:r>
           </w:p>
         </w:tc>
@@ -1819,7 +1855,7 @@
                 <w:i w:val="0"/>
                 <w:sz w:val="24"/>
               </w:rPr>
-              <w:t>Pendiente</w:t>
+              <w:t>Sí</w:t>
             </w:r>
           </w:p>
         </w:tc>
@@ -4414,7 +4450,7 @@
                 <w:i w:val="0"/>
                 <w:sz w:val="24"/>
               </w:rPr>
-              <w:t>4/6 completos, 1 parcial, 1 pendiente (67%)</w:t>
+              <w:t>6/6 completos (100%)</w:t>
             </w:r>
           </w:p>
         </w:tc>
@@ -4434,7 +4470,7 @@
                 <w:i w:val="0"/>
                 <w:sz w:val="24"/>
               </w:rPr>
-              <w:t>🟡 En ejecución</w:t>
+              <w:t>🟢 Cerrado</w:t>
             </w:r>
           </w:p>
         </w:tc>
@@ -4578,7 +4614,7 @@
                 <w:i w:val="0"/>
                 <w:sz w:val="24"/>
               </w:rPr>
-              <w:t>Tests de integración e2e en verde para ambos flujos; documentación de cierre (OpenAPI dedicado, README/ROADMAP/Matriz) aún pendiente</w:t>
+              <w:t>Tests de integración e2e en verde para ambos flujos; documentación de cierre (OpenAPI dedicado, README/ROADMAP/Matriz de Trazabilidad) completa</w:t>
             </w:r>
           </w:p>
         </w:tc>
@@ -4598,7 +4634,7 @@
                 <w:i w:val="0"/>
                 <w:sz w:val="24"/>
               </w:rPr>
-              <w:t>🟡 En ejecución</w:t>
+              <w:t>🟢 Cerrado</w:t>
             </w:r>
           </w:p>
         </w:tc>
@@ -4644,7 +4680,7 @@
           <w:i w:val="0"/>
           <w:sz w:val="24"/>
         </w:rPr>
-        <w:t>Sprint iniciado: implementación funcional de ambos flujos completa (backend + ai-services), con tests de integración en verde. Pendiente antes del cierre formal: (1) gestionar el contrato de datos con MINSA/DIRESA Tacna, dependencia externa no controlada por el equipo de desarrollo, y (2) completar la documentación de cierre (OpenAPI dedicado para el consumidor externo, README, ROADMAP, Matriz de Trazabilidad).</w:t>
+        <w:t>Sprint cerrado: implementación funcional de ambos flujos completa (backend + ai-services), con tests de integración en verde, y documentación de cierre completa (OpenAPI dedicado para el consumidor externo, README, ROADMAP, Matriz de Trazabilidad). Queda como dependencia externa, fuera del control del equipo de desarrollo y no bloqueante para este cierre: gestionar el contrato de datos formal con MINSA/DIRESA Tacna para la puesta en producción del consumo real del API (el endpoint ya está implementado, documentado y probado contra el contrato de datos asumido en este Sprint).</w:t>
       </w:r>
     </w:p>
     <w:p>
@@ -4672,7 +4708,7 @@
           <w:i w:val="0"/>
           <w:sz w:val="24"/>
         </w:rPr>
-        <w:t>Cierre del Sprint 13 y aprendizajes a incorporar (a completar tras el cierre formal, cuando la documentación pendiente esté lista):</w:t>
+        <w:t>Cierre del Sprint 13:</w:t>
       </w:r>
     </w:p>
     <w:p>
@@ -4687,6 +4723,160 @@
           <w:sz w:val="24"/>
         </w:rPr>
         <w:t>Sprint identificado como extensión de alcance tras una revisión de requerimientos, objetivos y avances del proyecto frente al SRS/Visión original (FD02/FD03), una vez cerrados los 13 sprints originales (Sprint 0 a Sprint 12, 100% completados). Durante la ejecución se ajustó el mecanismo técnico del entregable de wearables-IA: en vez de reentrenar los modelos ML con vitales como feature (lo cual hubiera requerido rediseñar el pipeline de un clasificador de texto a uno tabular), se optó por una capa de validación clínica basada en reglas que cumple el mismo objetivo funcional (enriquecer la predicción con datos de wearables, con fallback controlado) sin ese costo. Lección: al planificar sprints de integración de nuevas señales en un modelo ML existente, verificar primero la naturaleza del modelo (texto vs. tabular) antes de comprometer "feature engineering" como entregable literal.</w:t>
+      </w:r>
+    </w:p>
+    <w:p>
+      <w:pPr>
+        <w:jc w:val="both"/>
+      </w:pPr>
+      <w:r>
+        <w:rPr>
+          <w:rFonts w:ascii="Times New Roman" w:hAnsi="Times New Roman" w:cs="Times New Roman"/>
+          <w:b w:val="0"/>
+          <w:i w:val="0"/>
+          <w:sz w:val="24"/>
+        </w:rPr>
+        <w:t>Como parte del cierre de documentación se rediseñó también el Panel del médico (</w:t>
+      </w:r>
+      <w:r>
+        <w:rPr>
+          <w:rFonts w:ascii="Consolas" w:hAnsi="Consolas" w:cs="Consolas"/>
+          <w:b w:val="0"/>
+          <w:i w:val="0"/>
+          <w:sz w:val="18"/>
+        </w:rPr>
+        <w:t>web/src/pages/PatientMonitoringPage.js</w:t>
+      </w:r>
+      <w:r>
+        <w:rPr>
+          <w:rFonts w:ascii="Times New Roman" w:hAnsi="Times New Roman" w:cs="Times New Roman"/>
+          <w:b w:val="0"/>
+          <w:i w:val="0"/>
+          <w:sz w:val="24"/>
+        </w:rPr>
+        <w:t xml:space="preserve">) sobre la infraestructura de tiempo real ya existente (WebSocket </w:t>
+      </w:r>
+      <w:r>
+        <w:rPr>
+          <w:rFonts w:ascii="Consolas" w:hAnsi="Consolas" w:cs="Consolas"/>
+          <w:b w:val="0"/>
+          <w:i w:val="0"/>
+          <w:sz w:val="18"/>
+        </w:rPr>
+        <w:t>/ws/doctor</w:t>
+      </w:r>
+      <w:r>
+        <w:rPr>
+          <w:rFonts w:ascii="Times New Roman" w:hAnsi="Times New Roman" w:cs="Times New Roman"/>
+          <w:b w:val="0"/>
+          <w:i w:val="0"/>
+          <w:sz w:val="24"/>
+        </w:rPr>
+        <w:t xml:space="preserve">, </w:t>
+      </w:r>
+      <w:r>
+        <w:rPr>
+          <w:rFonts w:ascii="Consolas" w:hAnsi="Consolas" w:cs="Consolas"/>
+          <w:b w:val="0"/>
+          <w:i w:val="0"/>
+          <w:sz w:val="18"/>
+        </w:rPr>
+        <w:t>vitalsEmitter.ts</w:t>
+      </w:r>
+      <w:r>
+        <w:rPr>
+          <w:rFonts w:ascii="Times New Roman" w:hAnsi="Times New Roman" w:cs="Times New Roman"/>
+          <w:b w:val="0"/>
+          <w:i w:val="0"/>
+          <w:sz w:val="24"/>
+        </w:rPr>
+        <w:t xml:space="preserve">), añadiendo clasificación clínica de 4 niveles (crítico/alto/medio/bajo), tabla de pacientes bajo seguimiento y tendencia de SpO2 de 7 días — verificado extremo a extremo contra una base de datos real. Ese trabajo expuso y corrigió un bug real en </w:t>
+      </w:r>
+      <w:r>
+        <w:rPr>
+          <w:rFonts w:ascii="Consolas" w:hAnsi="Consolas" w:cs="Consolas"/>
+          <w:b w:val="0"/>
+          <w:i w:val="0"/>
+          <w:sz w:val="18"/>
+        </w:rPr>
+        <w:t>backend/src/dev/medicalHistoriesDev.ts</w:t>
+      </w:r>
+      <w:r>
+        <w:rPr>
+          <w:rFonts w:ascii="Times New Roman" w:hAnsi="Times New Roman" w:cs="Times New Roman"/>
+          <w:b w:val="0"/>
+          <w:i w:val="0"/>
+          <w:sz w:val="24"/>
+        </w:rPr>
+        <w:t xml:space="preserve">: el filtrado de </w:t>
+      </w:r>
+      <w:r>
+        <w:rPr>
+          <w:rFonts w:ascii="Consolas" w:hAnsi="Consolas" w:cs="Consolas"/>
+          <w:b w:val="0"/>
+          <w:i w:val="0"/>
+          <w:sz w:val="18"/>
+        </w:rPr>
+        <w:t>GET /api/v1/medical-histories</w:t>
+      </w:r>
+      <w:r>
+        <w:rPr>
+          <w:rFonts w:ascii="Times New Roman" w:hAnsi="Times New Roman" w:cs="Times New Roman"/>
+          <w:b w:val="0"/>
+          <w:i w:val="0"/>
+          <w:sz w:val="24"/>
+        </w:rPr>
+        <w:t xml:space="preserve"> para el rol </w:t>
+      </w:r>
+      <w:r>
+        <w:rPr>
+          <w:rFonts w:ascii="Consolas" w:hAnsi="Consolas" w:cs="Consolas"/>
+          <w:b w:val="0"/>
+          <w:i w:val="0"/>
+          <w:sz w:val="18"/>
+        </w:rPr>
+        <w:t>doctor</w:t>
+      </w:r>
+      <w:r>
+        <w:rPr>
+          <w:rFonts w:ascii="Times New Roman" w:hAnsi="Times New Roman" w:cs="Times New Roman"/>
+          <w:b w:val="0"/>
+          <w:i w:val="0"/>
+          <w:sz w:val="24"/>
+        </w:rPr>
+        <w:t xml:space="preserve"> usaba incorrectamente el id del propio médico como </w:t>
+      </w:r>
+      <w:r>
+        <w:rPr>
+          <w:rFonts w:ascii="Consolas" w:hAnsi="Consolas" w:cs="Consolas"/>
+          <w:b w:val="0"/>
+          <w:i w:val="0"/>
+          <w:sz w:val="18"/>
+        </w:rPr>
+        <w:t>patientId</w:t>
+      </w:r>
+      <w:r>
+        <w:rPr>
+          <w:rFonts w:ascii="Times New Roman" w:hAnsi="Times New Roman" w:cs="Times New Roman"/>
+          <w:b w:val="0"/>
+          <w:i w:val="0"/>
+          <w:sz w:val="24"/>
+        </w:rPr>
+        <w:t>, devolviendo siempre una lista vacía. Lección: la verificación end-to-end contra datos reales (no solo contra mocks) sigue siendo la forma más efectiva de encontrar este tipo de bug de filtrado silencioso.</w:t>
+      </w:r>
+    </w:p>
+    <w:p>
+      <w:pPr>
+        <w:jc w:val="both"/>
+      </w:pPr>
+      <w:r>
+        <w:rPr>
+          <w:rFonts w:ascii="Times New Roman" w:hAnsi="Times New Roman" w:cs="Times New Roman"/>
+          <w:b w:val="0"/>
+          <w:i w:val="0"/>
+          <w:sz w:val="24"/>
+        </w:rPr>
+        <w:t>Con este entregable, el Sprint 13 queda formalmente cerrado: 6/6 entregables aceptados, ambos flujos (interoperabilidad institucional y wearables-IA) probados en verde, y documentación de cierre (OpenAPI dedicado, README, ROADMAP, Matriz de Trazabilidad) completa.</w:t>
       </w:r>
     </w:p>
     <w:sectPr>

</xml_diff>